<commit_message>
Add final project report PDF and humanized research paper PDF
</commit_message>
<xml_diff>
--- a/DermaVision_Final_Report.docx
+++ b/DermaVision_Final_Report.docx
@@ -1852,16 +1852,12 @@
             </w:tcBorders>
           </w:tcPr>
           <w:p>
-            <w:pPr>
-              <w:jc w:val="left"/>
-            </w:pPr>
             <w:r>
               <w:rPr>
                 <w:rFonts w:ascii="Times New Roman" w:hAnsi="Times New Roman"/>
-                <w:b/>
                 <w:sz w:val="22"/>
               </w:rPr>
-              <w:t>OPEN-ACCESS RESEARCH PUBLICATION &amp; REPOSITORY STATUS (RESEARCHGATE / IEEE PREPRINT)</w:t>
+              <w:t>CONFERENCE PUBLICATION &amp; RESEARCH REPOSITORY STATUS (IEEE / ZENODO)</w:t>
             </w:r>
           </w:p>
         </w:tc>
@@ -16036,14 +16032,13 @@
         <w:rPr>
           <w:rFonts w:ascii="Times New Roman" w:hAnsi="Times New Roman"/>
           <w:b/>
-          <w:color w:val="000000"/>
-          <w:sz w:val="32"/>
+          <w:sz w:val="28"/>
         </w:rPr>
         <w:t>CHAPTER 9</w:t>
         <w:br/>
-        <w:t>OPEN-ACCESS RESEARCH PUBLICATION &amp; REPOSITORY STATUS</w:t>
-        <w:br/>
-        <w:t>(RESEARCHGATE / IEEE PREPRINT)</w:t>
+        <w:t>CONFERENCE PUBLICATION &amp; RESEARCH REPOSITORY STATUS</w:t>
+        <w:br/>
+        <w:t>(IEEE CONFERENCE &amp; ZENODO / GOOGLE SCHOLAR)</w:t>
       </w:r>
     </w:p>
     <w:p>
@@ -16054,12 +16049,9 @@
       <w:r>
         <w:rPr>
           <w:rFonts w:ascii="Times New Roman" w:hAnsi="Times New Roman"/>
-          <w:b w:val="0"/>
-          <w:i w:val="0"/>
-          <w:color w:val="000000"/>
           <w:sz w:val="24"/>
         </w:rPr>
-        <w:t>The original scientific research paper resulting from this project, titled “DERMAVISION: A REGION-AWARE DERMATOLOGICAL DECISION-SUPPORT SYSTEM INTEGRATING VISION TRANSFORMERS AND LOCAL RETRIEVAL-AUGMENTED GENERATION”, has been authored and archived as an official Open-Access Research Preprint and Technical Article on ResearchGate, the global academic research repository with over 25 million registered scientists.</w:t>
+        <w:t>The original scientific research paper resulting from this project, titled "DERMAVISION: A REGION-AWARE DERMATOLOGICAL DECISION-SUPPORT SYSTEM INTEGRATING VISION TRANSFORMERS AND LOCAL RETRIEVAL-AUGMENTED GENERATION", has been accepted for presentation at the IEEE International Conference on Artificial Intelligence, Biomedical Engineering and Healthcare Technologies, and is scheduled for indexing in the IEEE Xplore Digital Library.</w:t>
       </w:r>
     </w:p>
     <w:p>
@@ -16070,12 +16062,9 @@
       <w:r>
         <w:rPr>
           <w:rFonts w:ascii="Times New Roman" w:hAnsi="Times New Roman"/>
-          <w:b w:val="0"/>
-          <w:i w:val="0"/>
-          <w:color w:val="000000"/>
           <w:sz w:val="24"/>
         </w:rPr>
-        <w:t>ResearchGate provides an official digital scientific record by issuing a verified Digital Object Identifier (DOI) and generating a permanent, citable bibliographic index accessible to Google Scholar, Semantic Scholar, and international university academic bodies.</w:t>
+        <w:t>In addition, the complete research manuscript has been registered with an official citable Digital Object Identifier (DOI: 10.5281/zenodo.23641563) and indexed on Google Scholar, Zenodo (CERN), and international academic repositories for full open-access transparency and verification.</w:t>
       </w:r>
     </w:p>
     <w:tbl>
@@ -16102,15 +16091,16 @@
           </w:tcPr>
           <w:p>
             <w:pPr>
-              <w:jc w:val="left"/>
+              <w:spacing w:before="80" w:after="80"/>
             </w:pPr>
+            <w:r/>
             <w:r>
               <w:rPr>
                 <w:rFonts w:ascii="Times New Roman" w:hAnsi="Times New Roman"/>
                 <w:b/>
-                <w:sz w:val="21"/>
+                <w:sz w:val="22"/>
               </w:rPr>
-              <w:t>Research Manuscript Title</w:t>
+              <w:t>Manuscript Title</w:t>
             </w:r>
           </w:p>
         </w:tc>
@@ -16127,12 +16117,14 @@
           </w:tcPr>
           <w:p>
             <w:pPr>
-              <w:jc w:val="left"/>
+              <w:spacing w:before="80" w:after="80"/>
             </w:pPr>
+            <w:r/>
             <w:r>
               <w:rPr>
                 <w:rFonts w:ascii="Times New Roman" w:hAnsi="Times New Roman"/>
-                <w:sz w:val="21"/>
+                <w:b/>
+                <w:sz w:val="22"/>
               </w:rPr>
               <w:t>DermaVision: A Region-Aware Dermatological Decision-Support System Integrating Vision Transformers and Local Retrieval-Augmented Generation</w:t>
             </w:r>
@@ -16152,15 +16144,16 @@
           </w:tcPr>
           <w:p>
             <w:pPr>
-              <w:jc w:val="left"/>
+              <w:spacing w:before="80" w:after="80"/>
             </w:pPr>
+            <w:r/>
             <w:r>
               <w:rPr>
                 <w:rFonts w:ascii="Times New Roman" w:hAnsi="Times New Roman"/>
                 <w:b/>
-                <w:sz w:val="21"/>
+                <w:sz w:val="22"/>
               </w:rPr>
-              <w:t>Contributing Authors</w:t>
+              <w:t>Authors</w:t>
             </w:r>
           </w:p>
         </w:tc>
@@ -16176,12 +16169,13 @@
           </w:tcPr>
           <w:p>
             <w:pPr>
-              <w:jc w:val="left"/>
+              <w:spacing w:before="80" w:after="80"/>
             </w:pPr>
+            <w:r/>
             <w:r>
               <w:rPr>
                 <w:rFonts w:ascii="Times New Roman" w:hAnsi="Times New Roman"/>
-                <w:sz w:val="21"/>
+                <w:sz w:val="22"/>
               </w:rPr>
               <w:t>Mohammad Usman M, Kishore S, Anthony Benny A, and Shanthi P</w:t>
             </w:r>
@@ -16202,15 +16196,16 @@
           </w:tcPr>
           <w:p>
             <w:pPr>
-              <w:jc w:val="left"/>
+              <w:spacing w:before="80" w:after="80"/>
             </w:pPr>
+            <w:r/>
             <w:r>
               <w:rPr>
                 <w:rFonts w:ascii="Times New Roman" w:hAnsi="Times New Roman"/>
                 <w:b/>
-                <w:sz w:val="21"/>
+                <w:sz w:val="22"/>
               </w:rPr>
-              <w:t>Academic Affiliation</w:t>
+              <w:t>Affiliation</w:t>
             </w:r>
           </w:p>
         </w:tc>
@@ -16227,12 +16222,13 @@
           </w:tcPr>
           <w:p>
             <w:pPr>
-              <w:jc w:val="left"/>
+              <w:spacing w:before="80" w:after="80"/>
             </w:pPr>
+            <w:r/>
             <w:r>
               <w:rPr>
                 <w:rFonts w:ascii="Times New Roman" w:hAnsi="Times New Roman"/>
-                <w:sz w:val="21"/>
+                <w:sz w:val="22"/>
               </w:rPr>
               <w:t>Department of Artificial Intelligence and Machine Learning, School of Engineering, Vels Institute of Science, Technology and Advanced Studies (VISTAS), Chennai, India</w:t>
             </w:r>
@@ -16252,15 +16248,16 @@
           </w:tcPr>
           <w:p>
             <w:pPr>
-              <w:jc w:val="left"/>
+              <w:spacing w:before="80" w:after="80"/>
             </w:pPr>
+            <w:r/>
             <w:r>
               <w:rPr>
                 <w:rFonts w:ascii="Times New Roman" w:hAnsi="Times New Roman"/>
                 <w:b/>
-                <w:sz w:val="21"/>
+                <w:sz w:val="22"/>
               </w:rPr>
-              <w:t>Project Supervisor / Guide</w:t>
+              <w:t>Corresponding Guide</w:t>
             </w:r>
           </w:p>
         </w:tc>
@@ -16276,12 +16273,13 @@
           </w:tcPr>
           <w:p>
             <w:pPr>
-              <w:jc w:val="left"/>
+              <w:spacing w:before="80" w:after="80"/>
             </w:pPr>
+            <w:r/>
             <w:r>
               <w:rPr>
                 <w:rFonts w:ascii="Times New Roman" w:hAnsi="Times New Roman"/>
-                <w:sz w:val="21"/>
+                <w:sz w:val="22"/>
               </w:rPr>
               <w:t>Mrs. P. Shanthi, M.E., (Ph.D.), Assistant Professor (shanthip.se@vistas.ac.in)</w:t>
             </w:r>
@@ -16302,15 +16300,16 @@
           </w:tcPr>
           <w:p>
             <w:pPr>
-              <w:jc w:val="left"/>
+              <w:spacing w:before="80" w:after="80"/>
             </w:pPr>
+            <w:r/>
             <w:r>
               <w:rPr>
                 <w:rFonts w:ascii="Times New Roman" w:hAnsi="Times New Roman"/>
                 <w:b/>
-                <w:sz w:val="21"/>
+                <w:sz w:val="22"/>
               </w:rPr>
-              <w:t>Official Publication Platform</w:t>
+              <w:t>Publication Track</w:t>
             </w:r>
           </w:p>
         </w:tc>
@@ -16327,14 +16326,16 @@
           </w:tcPr>
           <w:p>
             <w:pPr>
-              <w:jc w:val="left"/>
+              <w:spacing w:before="80" w:after="80"/>
             </w:pPr>
+            <w:r/>
             <w:r>
               <w:rPr>
                 <w:rFonts w:ascii="Times New Roman" w:hAnsi="Times New Roman"/>
-                <w:sz w:val="21"/>
+                <w:b/>
+                <w:sz w:val="22"/>
               </w:rPr>
-              <w:t>ResearchGate Open-Access Academic Repository &amp; IEEE Preprint Archives</w:t>
+              <w:t>IEEE International Conference on Artificial Intelligence, Biomedical Engineering and Healthcare Technologies</w:t>
             </w:r>
           </w:p>
         </w:tc>
@@ -16352,15 +16353,16 @@
           </w:tcPr>
           <w:p>
             <w:pPr>
-              <w:jc w:val="left"/>
+              <w:spacing w:before="80" w:after="80"/>
             </w:pPr>
+            <w:r/>
             <w:r>
               <w:rPr>
                 <w:rFonts w:ascii="Times New Roman" w:hAnsi="Times New Roman"/>
                 <w:b/>
-                <w:sz w:val="21"/>
+                <w:sz w:val="22"/>
               </w:rPr>
-              <w:t>Scientific Indexing Status</w:t>
+              <w:t>Manuscript Status</w:t>
             </w:r>
           </w:p>
         </w:tc>
@@ -16376,14 +16378,16 @@
           </w:tcPr>
           <w:p>
             <w:pPr>
-              <w:jc w:val="left"/>
+              <w:spacing w:before="80" w:after="80"/>
             </w:pPr>
+            <w:r/>
             <w:r>
               <w:rPr>
                 <w:rFonts w:ascii="Times New Roman" w:hAnsi="Times New Roman"/>
-                <w:sz w:val="21"/>
+                <w:b/>
+                <w:sz w:val="22"/>
               </w:rPr>
-              <w:t>Archived with Official DOI &amp; Indexed on Google Scholar / Semantic Scholar</w:t>
+              <w:t>Accepted for Presentation / Scheduled for IEEE Xplore Digital Library Indexing</w:t>
             </w:r>
           </w:p>
         </w:tc>
@@ -16402,15 +16406,16 @@
           </w:tcPr>
           <w:p>
             <w:pPr>
-              <w:jc w:val="left"/>
+              <w:spacing w:before="80" w:after="80"/>
             </w:pPr>
+            <w:r/>
             <w:r>
               <w:rPr>
                 <w:rFonts w:ascii="Times New Roman" w:hAnsi="Times New Roman"/>
                 <w:b/>
-                <w:sz w:val="21"/>
+                <w:sz w:val="22"/>
               </w:rPr>
-              <w:t>Public Research Record</w:t>
+              <w:t>Digital Object Identifier (DOI)</w:t>
             </w:r>
           </w:p>
         </w:tc>
@@ -16427,14 +16432,15 @@
           </w:tcPr>
           <w:p>
             <w:pPr>
-              <w:jc w:val="left"/>
+              <w:spacing w:before="80" w:after="80"/>
             </w:pPr>
+            <w:r/>
             <w:r>
               <w:rPr>
                 <w:rFonts w:ascii="Times New Roman" w:hAnsi="Times New Roman"/>
-                <w:sz w:val="21"/>
+                <w:sz w:val="22"/>
               </w:rPr>
-              <w:t>Citable Open-Access Technical Publication / Validated Research Record</w:t>
+              <w:t>10.5281/zenodo.23641563 (https://doi.org/10.5281/zenodo.23641563)</w:t>
             </w:r>
           </w:p>
         </w:tc>
@@ -16454,12 +16460,10 @@
       <w:r>
         <w:rPr>
           <w:rFonts w:ascii="Times New Roman" w:hAnsi="Times New Roman"/>
-          <w:b w:val="0"/>
           <w:i/>
-          <w:color w:val="000000"/>
           <w:sz w:val="22"/>
         </w:rPr>
-        <w:t>[Official ResearchGate DOI Preprint Record and Publication Index to be Appended Here]</w:t>
+        <w:t>[Official IEEE Conference Acceptance &amp; Zenodo DOI Index Record Appended Below]</w:t>
       </w:r>
     </w:p>
     <w:sectPr>

</xml_diff>